<commit_message>
Paper: fix two section references, PDF re-exported
</commit_message>
<xml_diff>
--- a/topic7/paper/23BCE0757_Paper07.docx
+++ b/topic7/paper/23BCE0757_Paper07.docx
@@ -301,7 +301,7 @@
         <w:t>Scope and honesty.</w:t>
       </w:r>
       <w:r>
-        <w:t xml:space="preserve"> Every result uses the real table, but the table does not record everything a clinic decision needs: it has no overbooking decisions, no waiting list and no times within a day. The decisions in the logs are therefore generated by a behaviour policy, the waiting list is simulated, and overtime and waiting are counted in patients (Section 6.1). Findings concern algorithms, not clinics, and no clinical claim is made.</w:t>
+        <w:t xml:space="preserve"> Every result uses the real table, but the table does not record everything a clinic decision needs: it has no overbooking decisions, no waiting list and no times within a day. The decisions in the logs are therefore generated by a behaviour policy, the waiting list is simulated, and overtime and waiting are counted in patients (Section 9). Findings concern algorithms, not clinics, and no clinical claim is made.</w:t>
       </w:r>
     </w:p>
     <w:p>
@@ -6664,7 +6664,7 @@
         <w:jc w:val="both"/>
       </w:pPr>
       <w:r>
-        <w:t>Sections 7.1 to 7.4 show that the learners are held back by the support of the logged data. Table 6 adds the structured model of Section 5.2 and the baselines of Section 6.3. With the same 150 logged days per replicate, DP on the structured model scored 182.54 ± 0.01: +12.25 ± 0.99 above DP on the estimated MDP, +15.49 ± 2.11 above Q-learning and +19.74 ± 2.25 above MC (all p &lt; 0.001, ahead in 20 of 20 replicates against each), and +8.92 above the oracle fitted to ten times as much data (p &lt; 0.001, paired over 1,000 episodes). Its interval of ±0.01 shows that the policy hardly depends on the data draw. Of the baselines from published work, threshold double booking scored 164.53, a fixed booking of 2 extra patients 174.61 and the single session optimiser 182.03; the structured model is ahead of them by +18.01, +7.92 and +0.51 ± 0.22 (p &lt; 0.001, paired over 1,000 episodes). The last margin is 0.3% of the return.</w:t>
+        <w:t>Sections 7.1 to 7.4 show that the learners are held back by the support of the logged data. Table 6 adds the structured model of Section 5.2 and the baselines of Section 6.2. With the same 150 logged days per replicate, DP on the structured model scored 182.54 ± 0.01: +12.25 ± 0.99 above DP on the estimated MDP, +15.49 ± 2.11 above Q-learning and +19.74 ± 2.25 above MC (all p &lt; 0.001, ahead in 20 of 20 replicates against each), and +8.92 above the oracle fitted to ten times as much data (p &lt; 0.001, paired over 1,000 episodes). Its interval of ±0.01 shows that the policy hardly depends on the data draw. Of the baselines from published work, threshold double booking scored 164.53, a fixed booking of 2 extra patients 174.61 and the single session optimiser 182.03; the structured model is ahead of them by +18.01, +7.92 and +0.51 ± 0.22 (p &lt; 0.001, paired over 1,000 episodes). The last margin is 0.3% of the return.</w:t>
       </w:r>
     </w:p>
     <w:p>

</xml_diff>